<commit_message>
feat: add product creation endpoint
</commit_message>
<xml_diff>
--- a/sprints.docx
+++ b/sprints.docx
@@ -15,8 +15,6 @@
           <w:szCs w:val="36"/>
         </w:rPr>
       </w:pPr>
-      <w:bookmarkStart w:id="0" w:name="_GoBack"/>
-      <w:bookmarkEnd w:id="0"/>
       <w:r>
         <w:rPr>
           <w:rFonts w:ascii="Times New Roman" w:eastAsia="Times New Roman" w:hAnsi="Times New Roman" w:cs="Times New Roman"/>
@@ -352,6 +350,222 @@
       </w:r>
     </w:p>
     <w:p/>
+    <w:p/>
+    <w:p>
+      <w:r>
+        <w:t>Sprint 1 concluída:</w:t>
+      </w:r>
+    </w:p>
+    <w:p>
+      <w:r>
+        <w:rPr>
+          <w:rFonts w:ascii="Segoe UI Symbol" w:hAnsi="Segoe UI Symbol" w:cs="Segoe UI Symbol"/>
+        </w:rPr>
+        <w:t>✔</w:t>
+      </w:r>
+      <w:r>
+        <w:t xml:space="preserve"> Projeto criado</w:t>
+      </w:r>
+    </w:p>
+    <w:p>
+      <w:r>
+        <w:rPr>
+          <w:rFonts w:ascii="Segoe UI Symbol" w:hAnsi="Segoe UI Symbol" w:cs="Segoe UI Symbol"/>
+        </w:rPr>
+        <w:t>✔</w:t>
+      </w:r>
+      <w:r>
+        <w:t xml:space="preserve"> Git local iniciado</w:t>
+      </w:r>
+    </w:p>
+    <w:p>
+      <w:r>
+        <w:rPr>
+          <w:rFonts w:ascii="Segoe UI Symbol" w:hAnsi="Segoe UI Symbol" w:cs="Segoe UI Symbol"/>
+        </w:rPr>
+        <w:t>✔</w:t>
+      </w:r>
+      <w:r>
+        <w:t xml:space="preserve"> Branch main</w:t>
+      </w:r>
+    </w:p>
+    <w:p>
+      <w:pPr>
+        <w:rPr>
+          <w:lang w:val="en-US"/>
+        </w:rPr>
+      </w:pPr>
+      <w:r>
+        <w:rPr>
+          <w:rFonts w:ascii="Segoe UI Symbol" w:hAnsi="Segoe UI Symbol" w:cs="Segoe UI Symbol"/>
+          <w:lang w:val="en-US"/>
+        </w:rPr>
+        <w:t>✔</w:t>
+      </w:r>
+      <w:r>
+        <w:rPr>
+          <w:lang w:val="en-US"/>
+        </w:rPr>
+        <w:t xml:space="preserve"> Branch develop</w:t>
+      </w:r>
+    </w:p>
+    <w:p>
+      <w:pPr>
+        <w:rPr>
+          <w:lang w:val="en-US"/>
+        </w:rPr>
+      </w:pPr>
+      <w:r>
+        <w:rPr>
+          <w:rFonts w:ascii="Segoe UI Symbol" w:hAnsi="Segoe UI Symbol" w:cs="Segoe UI Symbol"/>
+          <w:lang w:val="en-US"/>
+        </w:rPr>
+        <w:t>✔</w:t>
+      </w:r>
+      <w:r>
+        <w:rPr>
+          <w:lang w:val="en-US"/>
+        </w:rPr>
+        <w:t xml:space="preserve"> .venv</w:t>
+      </w:r>
+    </w:p>
+    <w:p>
+      <w:pPr>
+        <w:rPr>
+          <w:lang w:val="en-US"/>
+        </w:rPr>
+      </w:pPr>
+      <w:r>
+        <w:rPr>
+          <w:rFonts w:ascii="Segoe UI Symbol" w:hAnsi="Segoe UI Symbol" w:cs="Segoe UI Symbol"/>
+          <w:lang w:val="en-US"/>
+        </w:rPr>
+        <w:t>✔</w:t>
+      </w:r>
+      <w:r>
+        <w:rPr>
+          <w:lang w:val="en-US"/>
+        </w:rPr>
+        <w:t xml:space="preserve"> dependências</w:t>
+      </w:r>
+    </w:p>
+    <w:p>
+      <w:pPr>
+        <w:rPr>
+          <w:lang w:val="en-US"/>
+        </w:rPr>
+      </w:pPr>
+      <w:r>
+        <w:rPr>
+          <w:rFonts w:ascii="Segoe UI Symbol" w:hAnsi="Segoe UI Symbol" w:cs="Segoe UI Symbol"/>
+          <w:lang w:val="en-US"/>
+        </w:rPr>
+        <w:t>✔</w:t>
+      </w:r>
+      <w:r>
+        <w:rPr>
+          <w:lang w:val="en-US"/>
+        </w:rPr>
+        <w:t xml:space="preserve"> health check</w:t>
+      </w:r>
+    </w:p>
+    <w:p>
+      <w:r>
+        <w:rPr>
+          <w:rFonts w:ascii="Segoe UI Symbol" w:hAnsi="Segoe UI Symbol" w:cs="Segoe UI Symbol"/>
+        </w:rPr>
+        <w:t>✔</w:t>
+      </w:r>
+      <w:r>
+        <w:t xml:space="preserve"> GitHub conectado</w:t>
+      </w:r>
+    </w:p>
+    <w:p>
+      <w:r>
+        <w:rPr>
+          <w:rFonts w:ascii="Segoe UI Symbol" w:hAnsi="Segoe UI Symbol" w:cs="Segoe UI Symbol"/>
+        </w:rPr>
+        <w:t>✔</w:t>
+      </w:r>
+      <w:r>
+        <w:t xml:space="preserve"> branches online</w:t>
+      </w:r>
+    </w:p>
+    <w:p>
+      <w:r>
+        <w:rPr>
+          <w:rFonts w:ascii="Segoe UI Symbol" w:hAnsi="Segoe UI Symbol" w:cs="Segoe UI Symbol"/>
+        </w:rPr>
+        <w:t>✔</w:t>
+      </w:r>
+      <w:r>
+        <w:t xml:space="preserve"> primeiro push feito</w:t>
+      </w:r>
+    </w:p>
+    <w:p/>
+    <w:p>
+      <w:pPr>
+        <w:spacing w:before="100" w:beforeAutospacing="1" w:after="100" w:afterAutospacing="1" w:line="240" w:lineRule="auto"/>
+        <w:rPr>
+          <w:rFonts w:ascii="Times New Roman" w:eastAsia="Times New Roman" w:hAnsi="Times New Roman" w:cs="Times New Roman"/>
+          <w:noProof w:val="0"/>
+          <w:sz w:val="24"/>
+          <w:szCs w:val="24"/>
+        </w:rPr>
+      </w:pPr>
+      <w:r>
+        <w:rPr>
+          <w:rFonts w:ascii="Times New Roman" w:eastAsia="Times New Roman" w:hAnsi="Times New Roman" w:cs="Times New Roman"/>
+          <w:noProof w:val="0"/>
+          <w:sz w:val="24"/>
+          <w:szCs w:val="24"/>
+        </w:rPr>
+        <w:lastRenderedPageBreak/>
+        <w:t>Próxima entrega:</w:t>
+      </w:r>
+    </w:p>
+    <w:p>
+      <w:pPr>
+        <w:tabs>
+          <w:tab w:val="left" w:pos="916"/>
+          <w:tab w:val="left" w:pos="1832"/>
+          <w:tab w:val="left" w:pos="2748"/>
+          <w:tab w:val="left" w:pos="3664"/>
+          <w:tab w:val="left" w:pos="4580"/>
+          <w:tab w:val="left" w:pos="5496"/>
+          <w:tab w:val="left" w:pos="6412"/>
+          <w:tab w:val="left" w:pos="7328"/>
+          <w:tab w:val="left" w:pos="8244"/>
+          <w:tab w:val="left" w:pos="9160"/>
+          <w:tab w:val="left" w:pos="10076"/>
+          <w:tab w:val="left" w:pos="10992"/>
+          <w:tab w:val="left" w:pos="11908"/>
+          <w:tab w:val="left" w:pos="12824"/>
+          <w:tab w:val="left" w:pos="13740"/>
+          <w:tab w:val="left" w:pos="14656"/>
+        </w:tabs>
+        <w:spacing w:after="0" w:line="240" w:lineRule="auto"/>
+        <w:rPr>
+          <w:rFonts w:ascii="Courier New" w:eastAsia="Times New Roman" w:hAnsi="Courier New" w:cs="Courier New"/>
+          <w:noProof w:val="0"/>
+          <w:sz w:val="20"/>
+          <w:szCs w:val="20"/>
+        </w:rPr>
+      </w:pPr>
+      <w:r>
+        <w:rPr>
+          <w:rFonts w:ascii="Courier New" w:eastAsia="Times New Roman" w:hAnsi="Courier New" w:cs="Courier New"/>
+          <w:noProof w:val="0"/>
+          <w:sz w:val="20"/>
+          <w:szCs w:val="20"/>
+        </w:rPr>
+        <w:t>Criar CRUD de produtos usando Model, Controller e Routes</w:t>
+      </w:r>
+    </w:p>
+    <w:p>
+      <w:bookmarkStart w:id="0" w:name="_GoBack"/>
+      <w:bookmarkEnd w:id="0"/>
+    </w:p>
     <w:sectPr>
       <w:pgSz w:w="12240" w:h="15840"/>
       <w:pgMar w:top="540" w:right="1701" w:bottom="1417" w:left="1701" w:header="720" w:footer="720" w:gutter="0"/>
@@ -905,7 +1119,6 @@
   <w:style w:type="character" w:default="1" w:styleId="Fontepargpadro">
     <w:name w:val="Default Paragraph Font"/>
     <w:uiPriority w:val="1"/>
-    <w:semiHidden/>
     <w:unhideWhenUsed/>
   </w:style>
   <w:style w:type="table" w:default="1" w:styleId="Tabelanormal">
@@ -968,6 +1181,56 @@
     <w:semiHidden/>
     <w:unhideWhenUsed/>
     <w:rsid w:val="00AF5603"/>
+    <w:rPr>
+      <w:rFonts w:ascii="Courier New" w:eastAsia="Times New Roman" w:hAnsi="Courier New" w:cs="Courier New"/>
+      <w:sz w:val="20"/>
+      <w:szCs w:val="20"/>
+    </w:rPr>
+  </w:style>
+  <w:style w:type="paragraph" w:styleId="Pr-formataoHTML">
+    <w:name w:val="HTML Preformatted"/>
+    <w:basedOn w:val="Normal"/>
+    <w:link w:val="Pr-formataoHTMLChar"/>
+    <w:uiPriority w:val="99"/>
+    <w:semiHidden/>
+    <w:unhideWhenUsed/>
+    <w:rsid w:val="003C3BD0"/>
+    <w:pPr>
+      <w:tabs>
+        <w:tab w:val="left" w:pos="916"/>
+        <w:tab w:val="left" w:pos="1832"/>
+        <w:tab w:val="left" w:pos="2748"/>
+        <w:tab w:val="left" w:pos="3664"/>
+        <w:tab w:val="left" w:pos="4580"/>
+        <w:tab w:val="left" w:pos="5496"/>
+        <w:tab w:val="left" w:pos="6412"/>
+        <w:tab w:val="left" w:pos="7328"/>
+        <w:tab w:val="left" w:pos="8244"/>
+        <w:tab w:val="left" w:pos="9160"/>
+        <w:tab w:val="left" w:pos="10076"/>
+        <w:tab w:val="left" w:pos="10992"/>
+        <w:tab w:val="left" w:pos="11908"/>
+        <w:tab w:val="left" w:pos="12824"/>
+        <w:tab w:val="left" w:pos="13740"/>
+        <w:tab w:val="left" w:pos="14656"/>
+      </w:tabs>
+      <w:spacing w:after="0" w:line="240" w:lineRule="auto"/>
+    </w:pPr>
+    <w:rPr>
+      <w:rFonts w:ascii="Courier New" w:eastAsia="Times New Roman" w:hAnsi="Courier New" w:cs="Courier New"/>
+      <w:noProof w:val="0"/>
+      <w:sz w:val="20"/>
+      <w:szCs w:val="20"/>
+      <w:lang w:val="en-US"/>
+    </w:rPr>
+  </w:style>
+  <w:style w:type="character" w:customStyle="1" w:styleId="Pr-formataoHTMLChar">
+    <w:name w:val="Pré-formatação HTML Char"/>
+    <w:basedOn w:val="Fontepargpadro"/>
+    <w:link w:val="Pr-formataoHTML"/>
+    <w:uiPriority w:val="99"/>
+    <w:semiHidden/>
+    <w:rsid w:val="003C3BD0"/>
     <w:rPr>
       <w:rFonts w:ascii="Courier New" w:eastAsia="Times New Roman" w:hAnsi="Courier New" w:cs="Courier New"/>
       <w:sz w:val="20"/>

</xml_diff>